<commit_message>
Add Martabe WIs batch 2 to SWI 205-006, 205-013, 205-015
Co-Authored-By: Claude Sonnet 5.5 <noreply@anthropic.com>
Claude-Session: https://claude.ai/code/session_0121qocWgsZdFAsne2oz9sHT
</commit_message>
<xml_diff>
--- a/SWI/205-Chemical-Testwork/MM-4034-033-OR-03-SWI-PRO-MET-205-006-Lime-Addition-and-Lime-Demand-Test-RevA.docx
+++ b/SWI/205-Chemical-Testwork/MM-4034-033-OR-03-SWI-PRO-MET-205-006-Lime-Addition-and-Lime-Demand-Test-RevA.docx
@@ -638,7 +638,7 @@
                 <w:sz w:val="17"/>
                 <w:szCs w:val="17"/>
               </w:rPr>
-              <w:t xml:space="preserve">DRAFT FOR REVIEW. Martabe work instruction 'Dosing NaOH vs Ca(OH)2 untuk mencapai pH 6,7,8 &amp; 9' added as Section 6 Part B. Not for use until reviewed and approved. JSEA JSEA-PRO-MET-205-006 must be updated for the added hazard row.</w:t>
+              <w:t xml:space="preserve">DRAFT FOR REVIEW. Martabe work instructions 'Dosing NaOH vs Ca(OH)2 untuk mencapai pH 6,7,8 &amp; 9' (Part B) and 'MHR1 sample - Konsumsi Quick lime metal removed' (Part C) added to Section 6. Not for use until reviewed and approved. JSEA JSEA-PRO-MET-205-006 must be updated for the added hazard rows.</w:t>
             </w:r>
           </w:p>
         </w:tc>
@@ -1426,6 +1426,56 @@
           </w:p>
         </w:tc>
       </w:tr>
+      <w:tr>
+        <w:tc>
+          <w:tcPr>
+            <w:tcW w:type="dxa" w:w="2900"/>
+            <w:tcMar>
+              <w:top w:type="dxa" w:w="55"/>
+              <w:left w:type="dxa" w:w="85"/>
+              <w:bottom w:type="dxa" w:w="55"/>
+              <w:right w:type="dxa" w:w="85"/>
+            </w:tcMar>
+          </w:tcPr>
+          <w:p>
+            <w:pPr>
+              <w:spacing w:after="0" w:line="235"/>
+            </w:pPr>
+            <w:r>
+              <w:rPr>
+                <w:rFonts w:ascii="Calibri" w:cs="Calibri" w:eastAsia="Calibri" w:hAnsi="Calibri"/>
+                <w:sz w:val="16"/>
+                <w:szCs w:val="16"/>
+              </w:rPr>
+              <w:t xml:space="preserve">[JSEA to confirm] Quicklime slaking in the sample and hydrogen peroxide contact</w:t>
+            </w:r>
+          </w:p>
+        </w:tc>
+        <w:tc>
+          <w:tcPr>
+            <w:tcW w:type="dxa" w:w="6126"/>
+            <w:tcMar>
+              <w:top w:type="dxa" w:w="55"/>
+              <w:left w:type="dxa" w:w="85"/>
+              <w:bottom w:type="dxa" w:w="55"/>
+              <w:right w:type="dxa" w:w="85"/>
+            </w:tcMar>
+          </w:tcPr>
+          <w:p>
+            <w:pPr>
+              <w:spacing w:after="0" w:line="235"/>
+            </w:pPr>
+            <w:r>
+              <w:rPr>
+                <w:rFonts w:ascii="Calibri" w:cs="Calibri" w:eastAsia="Calibri" w:hAnsi="Calibri"/>
+                <w:sz w:val="16"/>
+                <w:szCs w:val="16"/>
+              </w:rPr>
+              <w:t xml:space="preserve">Quicklime added in small increments to the stirred sample - slaking heats the slurry and can spit. Avoid dust. Face shield, chemical splash goggles and chemical-resistant gloves (the source lists only safety glasses and rubber gloves, which is below Section 4). Hydrogen peroxide handled with the same PPE; fresh solution, no storage in the work area.</w:t>
+            </w:r>
+          </w:p>
+        </w:tc>
+      </w:tr>
     </w:tbl>
     <w:p>
       <w:pPr>
@@ -2013,6 +2063,24 @@
     </w:p>
     <w:p>
       <w:pPr>
+        <w:pStyle w:val="ListParagraph"/>
+        <w:numPr>
+          <w:ilvl w:val="0"/>
+          <w:numId w:val="1"/>
+        </w:numPr>
+        <w:spacing w:after="60" w:line="245"/>
+      </w:pPr>
+      <w:r>
+        <w:rPr>
+          <w:rFonts w:ascii="Calibri" w:cs="Calibri" w:eastAsia="Calibri" w:hAnsi="Calibri"/>
+          <w:sz w:val="17"/>
+          <w:szCs w:val="17"/>
+        </w:rPr>
+        <w:t xml:space="preserve">[M] Quicklime (CaO), hydrogen peroxide (H2O2), plant air supply, three baffle tanks (A, B, C), magnetic stirrer or agitator, camera</w:t>
+      </w:r>
+    </w:p>
+    <w:p>
+      <w:pPr>
         <w:pStyle w:val="Heading1"/>
         <w:spacing w:after="120" w:before="260"/>
       </w:pPr>
@@ -2625,6 +2693,331 @@
     </w:p>
     <w:p>
       <w:pPr>
+        <w:spacing w:after="90" w:before="180" w:line="245"/>
+        <w:keepNext/>
+      </w:pPr>
+      <w:r>
+        <w:rPr>
+          <w:rFonts w:ascii="Calibri" w:cs="Calibri" w:eastAsia="Calibri" w:hAnsi="Calibri"/>
+          <w:b/>
+          <w:bCs/>
+          <w:color w:val="1F3864"/>
+          <w:sz w:val="19"/>
+          <w:szCs w:val="19"/>
+        </w:rPr>
+        <w:t xml:space="preserve">Part C - Quicklime consumption and metal removal on MHR-1 sample, with and without plant air and H2O2 [M]</w:t>
+      </w:r>
+    </w:p>
+    <w:p>
+      <w:pPr>
+        <w:spacing w:after="60" w:before="0" w:line="245"/>
+      </w:pPr>
+      <w:r>
+        <w:rPr>
+          <w:rFonts w:ascii="Calibri" w:cs="Calibri" w:eastAsia="Calibri" w:hAnsi="Calibri"/>
+          <w:sz w:val="17"/>
+          <w:szCs w:val="17"/>
+        </w:rPr>
+        <w:t xml:space="preserve">[M] = taken from the Martabe team work instruction "MHR1 sample - Konsumsi Quick lime metal removed (file name 'Work_Instruction_MHR_1_Liming_vs_Limingair')" (undated). [CONFIRM] = unspecified or inconsistent in the source; resolve before this instruction is approved for use.</w:t>
+      </w:r>
+    </w:p>
+    <w:p>
+      <w:pPr>
+        <w:spacing w:after="60" w:before="0" w:line="245"/>
+      </w:pPr>
+      <w:r>
+        <w:rPr>
+          <w:rFonts w:ascii="Calibri" w:cs="Calibri" w:eastAsia="Calibri" w:hAnsi="Calibri"/>
+          <w:sz w:val="17"/>
+          <w:szCs w:val="17"/>
+        </w:rPr>
+        <w:t xml:space="preserve">Purpose [M]: measure the quicklime needed to raise the MHR-1 sample to pH 7, and the metal removed. Three runs: A quicklime only, B with plant air, C with plant air and H2O2.</w:t>
+      </w:r>
+    </w:p>
+    <w:p>
+      <w:pPr>
+        <w:spacing w:after="60" w:before="0" w:line="245"/>
+      </w:pPr>
+      <w:r>
+        <w:rPr>
+          <w:rFonts w:ascii="Calibri" w:cs="Calibri" w:eastAsia="Calibri" w:hAnsi="Calibri"/>
+          <w:b/>
+          <w:sz w:val="17"/>
+          <w:szCs w:val="17"/>
+        </w:rPr>
+        <w:t xml:space="preserve">STOP condition (added at review, not in the source): this test takes the sample down to pH 4 and holds it below 10.5. Run it only on a sample confirmed free of cyanide. If cyanide is present at any level, do not start. [CONFIRM] MHR-1 is not defined in the source. State what it is and its origin.</w:t>
+      </w:r>
+    </w:p>
+    <w:p>
+      <w:pPr>
+        <w:spacing w:after="60" w:before="0" w:line="245"/>
+      </w:pPr>
+      <w:r>
+        <w:rPr>
+          <w:rFonts w:ascii="Calibri" w:cs="Calibri" w:eastAsia="Calibri" w:hAnsi="Calibri"/>
+          <w:b/>
+          <w:sz w:val="17"/>
+          <w:szCs w:val="17"/>
+        </w:rPr>
+        <w:t xml:space="preserve">Run A - quicklime only [M]</w:t>
+      </w:r>
+    </w:p>
+    <w:p>
+      <w:pPr>
+        <w:ind w:left="280"/>
+        <w:spacing w:after="50" w:before="0" w:line="245"/>
+      </w:pPr>
+      <w:r>
+        <w:rPr>
+          <w:rFonts w:ascii="Calibri" w:cs="Calibri" w:eastAsia="Calibri" w:hAnsi="Calibri"/>
+          <w:b/>
+          <w:bCs/>
+          <w:sz w:val="17"/>
+          <w:szCs w:val="17"/>
+        </w:rPr>
+        <w:t xml:space="preserve">14.</w:t>
+      </w:r>
+      <w:r>
+        <w:rPr>
+          <w:rFonts w:ascii="Calibri" w:cs="Calibri" w:eastAsia="Calibri" w:hAnsi="Calibri"/>
+          <w:sz w:val="17"/>
+          <w:szCs w:val="17"/>
+        </w:rPr>
+        <w:t xml:space="preserve">  Take 100 mL of sample as the initial MHR-1 feed. Measure the pH and submit for base metal assay.</w:t>
+      </w:r>
+    </w:p>
+    <w:p>
+      <w:pPr>
+        <w:ind w:left="280"/>
+        <w:spacing w:after="50" w:before="0" w:line="245"/>
+      </w:pPr>
+      <w:r>
+        <w:rPr>
+          <w:rFonts w:ascii="Calibri" w:cs="Calibri" w:eastAsia="Calibri" w:hAnsi="Calibri"/>
+          <w:b/>
+          <w:bCs/>
+          <w:sz w:val="17"/>
+          <w:szCs w:val="17"/>
+        </w:rPr>
+        <w:t xml:space="preserve">15.</w:t>
+      </w:r>
+      <w:r>
+        <w:rPr>
+          <w:rFonts w:ascii="Calibri" w:cs="Calibri" w:eastAsia="Calibri" w:hAnsi="Calibri"/>
+          <w:sz w:val="17"/>
+          <w:szCs w:val="17"/>
+        </w:rPr>
+        <w:t xml:space="preserve">  Take 1 L of MHR-1 sample into baffle tank 'A'. Photograph the initial condition of the sample.</w:t>
+      </w:r>
+    </w:p>
+    <w:p>
+      <w:pPr>
+        <w:ind w:left="280"/>
+        <w:spacing w:after="50" w:before="0" w:line="245"/>
+      </w:pPr>
+      <w:r>
+        <w:rPr>
+          <w:rFonts w:ascii="Calibri" w:cs="Calibri" w:eastAsia="Calibri" w:hAnsi="Calibri"/>
+          <w:b/>
+          <w:bCs/>
+          <w:sz w:val="17"/>
+          <w:szCs w:val="17"/>
+        </w:rPr>
+        <w:t xml:space="preserve">16.</w:t>
+      </w:r>
+      <w:r>
+        <w:rPr>
+          <w:rFonts w:ascii="Calibri" w:cs="Calibri" w:eastAsia="Calibri" w:hAnsi="Calibri"/>
+          <w:sz w:val="17"/>
+          <w:szCs w:val="17"/>
+        </w:rPr>
+        <w:t xml:space="preserve">  Start the agitator or magnetic stirrer to homogenise the sample.</w:t>
+      </w:r>
+    </w:p>
+    <w:p>
+      <w:pPr>
+        <w:ind w:left="280"/>
+        <w:spacing w:after="50" w:before="0" w:line="245"/>
+      </w:pPr>
+      <w:r>
+        <w:rPr>
+          <w:rFonts w:ascii="Calibri" w:cs="Calibri" w:eastAsia="Calibri" w:hAnsi="Calibri"/>
+          <w:b/>
+          <w:bCs/>
+          <w:sz w:val="17"/>
+          <w:szCs w:val="17"/>
+        </w:rPr>
+        <w:t xml:space="preserve">17.</w:t>
+      </w:r>
+      <w:r>
+        <w:rPr>
+          <w:rFonts w:ascii="Calibri" w:cs="Calibri" w:eastAsia="Calibri" w:hAnsi="Calibri"/>
+          <w:sz w:val="17"/>
+          <w:szCs w:val="17"/>
+        </w:rPr>
+        <w:t xml:space="preserve">  Measure the initial pH of each sample and record all measurements.</w:t>
+      </w:r>
+    </w:p>
+    <w:p>
+      <w:pPr>
+        <w:ind w:left="280"/>
+        <w:spacing w:after="50" w:before="0" w:line="245"/>
+      </w:pPr>
+      <w:r>
+        <w:rPr>
+          <w:rFonts w:ascii="Calibri" w:cs="Calibri" w:eastAsia="Calibri" w:hAnsi="Calibri"/>
+          <w:b/>
+          <w:bCs/>
+          <w:sz w:val="17"/>
+          <w:szCs w:val="17"/>
+        </w:rPr>
+        <w:t xml:space="preserve">18.</w:t>
+      </w:r>
+      <w:r>
+        <w:rPr>
+          <w:rFonts w:ascii="Calibri" w:cs="Calibri" w:eastAsia="Calibri" w:hAnsi="Calibri"/>
+          <w:sz w:val="17"/>
+          <w:szCs w:val="17"/>
+        </w:rPr>
+        <w:t xml:space="preserve">  Stage 1: add quicklime in small increments to raise the pH to 4. Wait for the pH to stabilise, photograph the sample and record the quicklime consumed.</w:t>
+      </w:r>
+    </w:p>
+    <w:p>
+      <w:pPr>
+        <w:ind w:left="280"/>
+        <w:spacing w:after="50" w:before="0" w:line="245"/>
+      </w:pPr>
+      <w:r>
+        <w:rPr>
+          <w:rFonts w:ascii="Calibri" w:cs="Calibri" w:eastAsia="Calibri" w:hAnsi="Calibri"/>
+          <w:b/>
+          <w:bCs/>
+          <w:sz w:val="17"/>
+          <w:szCs w:val="17"/>
+        </w:rPr>
+        <w:t xml:space="preserve">19.</w:t>
+      </w:r>
+      <w:r>
+        <w:rPr>
+          <w:rFonts w:ascii="Calibri" w:cs="Calibri" w:eastAsia="Calibri" w:hAnsi="Calibri"/>
+          <w:sz w:val="17"/>
+          <w:szCs w:val="17"/>
+        </w:rPr>
+        <w:t xml:space="preserve">  Repeat step 18 to reach pH 7, then pH 9, then pH 10. Document every pH change with a photograph and the quicklime consumed.</w:t>
+      </w:r>
+    </w:p>
+    <w:p>
+      <w:pPr>
+        <w:ind w:left="280"/>
+        <w:spacing w:after="50" w:before="0" w:line="245"/>
+      </w:pPr>
+      <w:r>
+        <w:rPr>
+          <w:rFonts w:ascii="Calibri" w:cs="Calibri" w:eastAsia="Calibri" w:hAnsi="Calibri"/>
+          <w:b/>
+          <w:bCs/>
+          <w:sz w:val="17"/>
+          <w:szCs w:val="17"/>
+        </w:rPr>
+        <w:t xml:space="preserve">20.</w:t>
+      </w:r>
+      <w:r>
+        <w:rPr>
+          <w:rFonts w:ascii="Calibri" w:cs="Calibri" w:eastAsia="Calibri" w:hAnsi="Calibri"/>
+          <w:sz w:val="17"/>
+          <w:szCs w:val="17"/>
+        </w:rPr>
+        <w:t xml:space="preserve">  At pH 7 and at pH 10 take 100 mL of sample for base metal assay.</w:t>
+      </w:r>
+    </w:p>
+    <w:p>
+      <w:pPr>
+        <w:spacing w:after="60" w:before="0" w:line="245"/>
+      </w:pPr>
+      <w:r>
+        <w:rPr>
+          <w:rFonts w:ascii="Calibri" w:cs="Calibri" w:eastAsia="Calibri" w:hAnsi="Calibri"/>
+          <w:b/>
+          <w:sz w:val="17"/>
+          <w:szCs w:val="17"/>
+        </w:rPr>
+        <w:t xml:space="preserve">Run B and Run C [M]</w:t>
+      </w:r>
+    </w:p>
+    <w:p>
+      <w:pPr>
+        <w:ind w:left="280"/>
+        <w:spacing w:after="50" w:before="0" w:line="245"/>
+      </w:pPr>
+      <w:r>
+        <w:rPr>
+          <w:rFonts w:ascii="Calibri" w:cs="Calibri" w:eastAsia="Calibri" w:hAnsi="Calibri"/>
+          <w:b/>
+          <w:bCs/>
+          <w:sz w:val="17"/>
+          <w:szCs w:val="17"/>
+        </w:rPr>
+        <w:t xml:space="preserve">21.</w:t>
+      </w:r>
+      <w:r>
+        <w:rPr>
+          <w:rFonts w:ascii="Calibri" w:cs="Calibri" w:eastAsia="Calibri" w:hAnsi="Calibri"/>
+          <w:sz w:val="17"/>
+          <w:szCs w:val="17"/>
+        </w:rPr>
+        <w:t xml:space="preserve">  Run B: repeat Run A for sample 'B' with plant air added. [CONFIRM] air flow and the way the air is added are not stated.</w:t>
+      </w:r>
+    </w:p>
+    <w:p>
+      <w:pPr>
+        <w:ind w:left="280"/>
+        <w:spacing w:after="50" w:before="0" w:line="245"/>
+      </w:pPr>
+      <w:r>
+        <w:rPr>
+          <w:rFonts w:ascii="Calibri" w:cs="Calibri" w:eastAsia="Calibri" w:hAnsi="Calibri"/>
+          <w:b/>
+          <w:bCs/>
+          <w:sz w:val="17"/>
+          <w:szCs w:val="17"/>
+        </w:rPr>
+        <w:t xml:space="preserve">22.</w:t>
+      </w:r>
+      <w:r>
+        <w:rPr>
+          <w:rFonts w:ascii="Calibri" w:cs="Calibri" w:eastAsia="Calibri" w:hAnsi="Calibri"/>
+          <w:sz w:val="17"/>
+          <w:szCs w:val="17"/>
+        </w:rPr>
+        <w:t xml:space="preserve">  Run C: repeat Run A for sample 'C' with plant air added and 0.5 mL H2O2 added at the start. [CONFIRM] H2O2 strength, and the sample volume the 0.5 mL applies to, are not stated.</w:t>
+      </w:r>
+    </w:p>
+    <w:p>
+      <w:pPr>
+        <w:ind w:left="280"/>
+        <w:spacing w:after="50" w:before="0" w:line="245"/>
+      </w:pPr>
+      <w:r>
+        <w:rPr>
+          <w:rFonts w:ascii="Calibri" w:cs="Calibri" w:eastAsia="Calibri" w:hAnsi="Calibri"/>
+          <w:b/>
+          <w:bCs/>
+          <w:sz w:val="17"/>
+          <w:szCs w:val="17"/>
+        </w:rPr>
+        <w:t xml:space="preserve">23.</w:t>
+      </w:r>
+      <w:r>
+        <w:rPr>
+          <w:rFonts w:ascii="Calibri" w:cs="Calibri" w:eastAsia="Calibri" w:hAnsi="Calibri"/>
+          <w:sz w:val="17"/>
+          <w:szCs w:val="17"/>
+        </w:rPr>
+        <w:t xml:space="preserve">  Record pH against quicklime (g) for every step on the record table (12 rows in the source) for each of A, B and C.</w:t>
+      </w:r>
+    </w:p>
+    <w:p>
+      <w:pPr>
         <w:pStyle w:val="Heading1"/>
         <w:spacing w:after="120" w:before="260"/>
       </w:pPr>
@@ -2852,6 +3245,24 @@
           <w:szCs w:val="17"/>
         </w:rPr>
         <w:t xml:space="preserve">Martabe work instruction 'Dosing NaOH vs Ca(OH)2 untuk mencapai pH 6,7,8,&amp;9' (Indonesian, undated) - Part B source</w:t>
+      </w:r>
+    </w:p>
+    <w:p>
+      <w:pPr>
+        <w:pStyle w:val="ListParagraph"/>
+        <w:numPr>
+          <w:ilvl w:val="0"/>
+          <w:numId w:val="1"/>
+        </w:numPr>
+        <w:spacing w:after="60" w:line="245"/>
+      </w:pPr>
+      <w:r>
+        <w:rPr>
+          <w:rFonts w:ascii="Calibri" w:cs="Calibri" w:eastAsia="Calibri" w:hAnsi="Calibri"/>
+          <w:sz w:val="17"/>
+          <w:szCs w:val="17"/>
+        </w:rPr>
+        <w:t xml:space="preserve">Martabe work instruction 'MHR1 sample - Konsumsi Quick lime metal removed' (Indonesian, undated; file name 'Work_Instruction_MHR_1_Liming_vs_Limingair') - Part C source</w:t>
       </w:r>
     </w:p>
     <w:sectPr>

</xml_diff>

<commit_message>
Add Martabe WIs batch 5 (MHR-1 quicklime/caustic, Cu preconditioning V2, copper adsorption)
Co-Authored-By: Claude Sonnet 5.5 <noreply@anthropic.com>
Claude-Session: https://claude.ai/code/session_0121qocWgsZdFAsne2oz9sHT
</commit_message>
<xml_diff>
--- a/SWI/205-Chemical-Testwork/MM-4034-033-OR-03-SWI-PRO-MET-205-006-Lime-Addition-and-Lime-Demand-Test-RevA.docx
+++ b/SWI/205-Chemical-Testwork/MM-4034-033-OR-03-SWI-PRO-MET-205-006-Lime-Addition-and-Lime-Demand-Test-RevA.docx
@@ -638,7 +638,7 @@
                 <w:sz w:val="17"/>
                 <w:szCs w:val="17"/>
               </w:rPr>
-              <w:t xml:space="preserve">DRAFT FOR REVIEW. Martabe work instructions 'Dosing NaOH vs Ca(OH)2 untuk mencapai pH 6,7,8 &amp; 9' (Part B) and 'MHR1 sample - Konsumsi Quick lime metal removed' (Part C) added to Section 6. Not for use until reviewed and approved. JSEA JSEA-PRO-MET-205-006 must be updated for the added hazard rows.</w:t>
+              <w:t xml:space="preserve">DRAFT FOR REVIEW. Martabe work instructions 'Dosing NaOH vs Ca(OH)2 untuk mencapai pH 6,7,8 &amp; 9' (Part B), 'MHR1 sample - Konsumsi Quick lime metal removed' (Part C) and 'MHR1 sample - Konsumsi Quick lime dan caustic' V1 and V1.2 (Part D) added to Section 6. Not for use until reviewed and approved. JSEA JSEA-PRO-MET-205-006 must be updated for the added hazard rows.</w:t>
             </w:r>
           </w:p>
         </w:tc>
@@ -2081,6 +2081,24 @@
     </w:p>
     <w:p>
       <w:pPr>
+        <w:pStyle w:val="ListParagraph"/>
+        <w:numPr>
+          <w:ilvl w:val="0"/>
+          <w:numId w:val="1"/>
+        </w:numPr>
+        <w:spacing w:after="60" w:line="245"/>
+      </w:pPr>
+      <w:r>
+        <w:rPr>
+          <w:rFonts w:ascii="Calibri" w:cs="Calibri" w:eastAsia="Calibri" w:hAnsi="Calibri"/>
+          <w:sz w:val="17"/>
+          <w:szCs w:val="17"/>
+        </w:rPr>
+        <w:t xml:space="preserve">[M] TDS meter, three baffle tanks, quicklime and caustic in 0.5 g doses</w:t>
+      </w:r>
+    </w:p>
+    <w:p>
+      <w:pPr>
         <w:pStyle w:val="Heading1"/>
         <w:spacing w:after="120" w:before="260"/>
       </w:pPr>
@@ -3018,6 +3036,316 @@
     </w:p>
     <w:p>
       <w:pPr>
+        <w:spacing w:after="90" w:before="180" w:line="245"/>
+        <w:keepNext/>
+      </w:pPr>
+      <w:r>
+        <w:rPr>
+          <w:rFonts w:ascii="Calibri" w:cs="Calibri" w:eastAsia="Calibri" w:hAnsi="Calibri"/>
+          <w:b/>
+          <w:bCs/>
+          <w:color w:val="1F3864"/>
+          <w:sz w:val="19"/>
+          <w:szCs w:val="19"/>
+        </w:rPr>
+        <w:t xml:space="preserve">Part D - Quicklime and caustic consumption to pH 7 on MHR-1, with TDS tracking [M]</w:t>
+      </w:r>
+    </w:p>
+    <w:p>
+      <w:pPr>
+        <w:spacing w:after="60" w:before="0" w:line="245"/>
+      </w:pPr>
+      <w:r>
+        <w:rPr>
+          <w:rFonts w:ascii="Calibri" w:cs="Calibri" w:eastAsia="Calibri" w:hAnsi="Calibri"/>
+          <w:sz w:val="17"/>
+          <w:szCs w:val="17"/>
+        </w:rPr>
+        <w:t xml:space="preserve">[M] = taken from the Martabe team work instruction "MHR1 sample - Konsumsi Quick lime dan caustic (V1 and V1.2)" (undated). [CONFIRM] = unspecified or inconsistent in the source; resolve before this instruction is approved for use.</w:t>
+      </w:r>
+    </w:p>
+    <w:p>
+      <w:pPr>
+        <w:spacing w:after="60" w:before="0" w:line="245"/>
+      </w:pPr>
+      <w:r>
+        <w:rPr>
+          <w:rFonts w:ascii="Calibri" w:cs="Calibri" w:eastAsia="Calibri" w:hAnsi="Calibri"/>
+          <w:sz w:val="17"/>
+          <w:szCs w:val="17"/>
+        </w:rPr>
+        <w:t xml:space="preserve">Purpose [M]: measure the quicklime and the caustic needed to raise the MHR-1 sample to pH 7 and watch how the TDS changes. V1.2 is the base; V1 is the earlier version with blank record tables and no fixed dose.</w:t>
+      </w:r>
+    </w:p>
+    <w:p>
+      <w:pPr>
+        <w:spacing w:after="60" w:before="0" w:line="245"/>
+      </w:pPr>
+      <w:r>
+        <w:rPr>
+          <w:rFonts w:ascii="Calibri" w:cs="Calibri" w:eastAsia="Calibri" w:hAnsi="Calibri"/>
+          <w:b/>
+          <w:sz w:val="17"/>
+          <w:szCs w:val="17"/>
+        </w:rPr>
+        <w:t xml:space="preserve">STOP condition (added at review): the same cyanide-free condition as Part B and Part C applies. The recorded runs in V1.2 start at pH 2.13.</w:t>
+      </w:r>
+    </w:p>
+    <w:p>
+      <w:pPr>
+        <w:ind w:left="280"/>
+        <w:spacing w:after="50" w:before="0" w:line="245"/>
+      </w:pPr>
+      <w:r>
+        <w:rPr>
+          <w:rFonts w:ascii="Calibri" w:cs="Calibri" w:eastAsia="Calibri" w:hAnsi="Calibri"/>
+          <w:b/>
+          <w:bCs/>
+          <w:sz w:val="17"/>
+          <w:szCs w:val="17"/>
+        </w:rPr>
+        <w:t xml:space="preserve">24.</w:t>
+      </w:r>
+      <w:r>
+        <w:rPr>
+          <w:rFonts w:ascii="Calibri" w:cs="Calibri" w:eastAsia="Calibri" w:hAnsi="Calibri"/>
+          <w:sz w:val="17"/>
+          <w:szCs w:val="17"/>
+        </w:rPr>
+        <w:t xml:space="preserve">  Take 100 mL of sample as the initial MHR-1 feed. Submit to ITS for pH and TDS.</w:t>
+      </w:r>
+    </w:p>
+    <w:p>
+      <w:pPr>
+        <w:ind w:left="280"/>
+        <w:spacing w:after="50" w:before="0" w:line="245"/>
+      </w:pPr>
+      <w:r>
+        <w:rPr>
+          <w:rFonts w:ascii="Calibri" w:cs="Calibri" w:eastAsia="Calibri" w:hAnsi="Calibri"/>
+          <w:b/>
+          <w:bCs/>
+          <w:sz w:val="17"/>
+          <w:szCs w:val="17"/>
+        </w:rPr>
+        <w:t xml:space="preserve">25.</w:t>
+      </w:r>
+      <w:r>
+        <w:rPr>
+          <w:rFonts w:ascii="Calibri" w:cs="Calibri" w:eastAsia="Calibri" w:hAnsi="Calibri"/>
+          <w:sz w:val="17"/>
+          <w:szCs w:val="17"/>
+        </w:rPr>
+        <w:t xml:space="preserve">  Take 2 L of MHR-1 sample and put it into baffle tanks 1, 2 and 3. [CONFIRM] whether 2 L goes into each tank or is split between them.</w:t>
+      </w:r>
+    </w:p>
+    <w:p>
+      <w:pPr>
+        <w:ind w:left="280"/>
+        <w:spacing w:after="50" w:before="0" w:line="245"/>
+      </w:pPr>
+      <w:r>
+        <w:rPr>
+          <w:rFonts w:ascii="Calibri" w:cs="Calibri" w:eastAsia="Calibri" w:hAnsi="Calibri"/>
+          <w:b/>
+          <w:bCs/>
+          <w:sz w:val="17"/>
+          <w:szCs w:val="17"/>
+        </w:rPr>
+        <w:t xml:space="preserve">26.</w:t>
+      </w:r>
+      <w:r>
+        <w:rPr>
+          <w:rFonts w:ascii="Calibri" w:cs="Calibri" w:eastAsia="Calibri" w:hAnsi="Calibri"/>
+          <w:sz w:val="17"/>
+          <w:szCs w:val="17"/>
+        </w:rPr>
+        <w:t xml:space="preserve">  Start the agitator or magnetic stirrer.</w:t>
+      </w:r>
+    </w:p>
+    <w:p>
+      <w:pPr>
+        <w:ind w:left="280"/>
+        <w:spacing w:after="50" w:before="0" w:line="245"/>
+      </w:pPr>
+      <w:r>
+        <w:rPr>
+          <w:rFonts w:ascii="Calibri" w:cs="Calibri" w:eastAsia="Calibri" w:hAnsi="Calibri"/>
+          <w:b/>
+          <w:bCs/>
+          <w:sz w:val="17"/>
+          <w:szCs w:val="17"/>
+        </w:rPr>
+        <w:t xml:space="preserve">27.</w:t>
+      </w:r>
+      <w:r>
+        <w:rPr>
+          <w:rFonts w:ascii="Calibri" w:cs="Calibri" w:eastAsia="Calibri" w:hAnsi="Calibri"/>
+          <w:sz w:val="17"/>
+          <w:szCs w:val="17"/>
+        </w:rPr>
+        <w:t xml:space="preserve">  Measure the initial pH and TDS of each sample and record them.</w:t>
+      </w:r>
+    </w:p>
+    <w:p>
+      <w:pPr>
+        <w:ind w:left="280"/>
+        <w:spacing w:after="50" w:before="0" w:line="245"/>
+      </w:pPr>
+      <w:r>
+        <w:rPr>
+          <w:rFonts w:ascii="Calibri" w:cs="Calibri" w:eastAsia="Calibri" w:hAnsi="Calibri"/>
+          <w:b/>
+          <w:bCs/>
+          <w:sz w:val="17"/>
+          <w:szCs w:val="17"/>
+        </w:rPr>
+        <w:t xml:space="preserve">28.</w:t>
+      </w:r>
+      <w:r>
+        <w:rPr>
+          <w:rFonts w:ascii="Calibri" w:cs="Calibri" w:eastAsia="Calibri" w:hAnsi="Calibri"/>
+          <w:sz w:val="17"/>
+          <w:szCs w:val="17"/>
+        </w:rPr>
+        <w:t xml:space="preserve">  Add 0.5 g of quicklime to each sample.</w:t>
+      </w:r>
+    </w:p>
+    <w:p>
+      <w:pPr>
+        <w:ind w:left="280"/>
+        <w:spacing w:after="50" w:before="0" w:line="245"/>
+      </w:pPr>
+      <w:r>
+        <w:rPr>
+          <w:rFonts w:ascii="Calibri" w:cs="Calibri" w:eastAsia="Calibri" w:hAnsi="Calibri"/>
+          <w:b/>
+          <w:bCs/>
+          <w:sz w:val="17"/>
+          <w:szCs w:val="17"/>
+        </w:rPr>
+        <w:t xml:space="preserve">29.</w:t>
+      </w:r>
+      <w:r>
+        <w:rPr>
+          <w:rFonts w:ascii="Calibri" w:cs="Calibri" w:eastAsia="Calibri" w:hAnsi="Calibri"/>
+          <w:sz w:val="17"/>
+          <w:szCs w:val="17"/>
+        </w:rPr>
+        <w:t xml:space="preserve">  Record the pH and the TDS value after each addition.</w:t>
+      </w:r>
+    </w:p>
+    <w:p>
+      <w:pPr>
+        <w:ind w:left="280"/>
+        <w:spacing w:after="50" w:before="0" w:line="245"/>
+      </w:pPr>
+      <w:r>
+        <w:rPr>
+          <w:rFonts w:ascii="Calibri" w:cs="Calibri" w:eastAsia="Calibri" w:hAnsi="Calibri"/>
+          <w:b/>
+          <w:bCs/>
+          <w:sz w:val="17"/>
+          <w:szCs w:val="17"/>
+        </w:rPr>
+        <w:t xml:space="preserve">30.</w:t>
+      </w:r>
+      <w:r>
+        <w:rPr>
+          <w:rFonts w:ascii="Calibri" w:cs="Calibri" w:eastAsia="Calibri" w:hAnsi="Calibri"/>
+          <w:sz w:val="17"/>
+          <w:szCs w:val="17"/>
+        </w:rPr>
+        <w:t xml:space="preserve">  Repeat the 0.5 g additions until the final pH is 7. Added at review: the recorded V1.2 runs went from pH 6.2 to 9.58 on a single 0.5 g addition, so use smaller doses once the pH passes about 5.5 to avoid overshooting pH 7.</w:t>
+      </w:r>
+    </w:p>
+    <w:p>
+      <w:pPr>
+        <w:ind w:left="280"/>
+        <w:spacing w:after="50" w:before="0" w:line="245"/>
+      </w:pPr>
+      <w:r>
+        <w:rPr>
+          <w:rFonts w:ascii="Calibri" w:cs="Calibri" w:eastAsia="Calibri" w:hAnsi="Calibri"/>
+          <w:b/>
+          <w:bCs/>
+          <w:sz w:val="17"/>
+          <w:szCs w:val="17"/>
+        </w:rPr>
+        <w:t xml:space="preserve">31.</w:t>
+      </w:r>
+      <w:r>
+        <w:rPr>
+          <w:rFonts w:ascii="Calibri" w:cs="Calibri" w:eastAsia="Calibri" w:hAnsi="Calibri"/>
+          <w:sz w:val="17"/>
+          <w:szCs w:val="17"/>
+        </w:rPr>
+        <w:t xml:space="preserve">  Observe the final change, photograph the sample and note whether a precipitate has formed.</w:t>
+      </w:r>
+    </w:p>
+    <w:p>
+      <w:pPr>
+        <w:ind w:left="280"/>
+        <w:spacing w:after="50" w:before="0" w:line="245"/>
+      </w:pPr>
+      <w:r>
+        <w:rPr>
+          <w:rFonts w:ascii="Calibri" w:cs="Calibri" w:eastAsia="Calibri" w:hAnsi="Calibri"/>
+          <w:b/>
+          <w:bCs/>
+          <w:sz w:val="17"/>
+          <w:szCs w:val="17"/>
+        </w:rPr>
+        <w:t xml:space="preserve">32.</w:t>
+      </w:r>
+      <w:r>
+        <w:rPr>
+          <w:rFonts w:ascii="Calibri" w:cs="Calibri" w:eastAsia="Calibri" w:hAnsi="Calibri"/>
+          <w:sz w:val="17"/>
+          <w:szCs w:val="17"/>
+        </w:rPr>
+        <w:t xml:space="preserve">  Take 100 mL from each sample and submit to ITS for final pH and TDS. [CONFIRM] V1.2 says samples 1 and 2 only, V1 says 1, 2 and 3.</w:t>
+      </w:r>
+    </w:p>
+    <w:p>
+      <w:pPr>
+        <w:ind w:left="280"/>
+        <w:spacing w:after="50" w:before="0" w:line="245"/>
+      </w:pPr>
+      <w:r>
+        <w:rPr>
+          <w:rFonts w:ascii="Calibri" w:cs="Calibri" w:eastAsia="Calibri" w:hAnsi="Calibri"/>
+          <w:b/>
+          <w:bCs/>
+          <w:sz w:val="17"/>
+          <w:szCs w:val="17"/>
+        </w:rPr>
+        <w:t xml:space="preserve">33.</w:t>
+      </w:r>
+      <w:r>
+        <w:rPr>
+          <w:rFonts w:ascii="Calibri" w:cs="Calibri" w:eastAsia="Calibri" w:hAnsi="Calibri"/>
+          <w:sz w:val="17"/>
+          <w:szCs w:val="17"/>
+        </w:rPr>
+        <w:t xml:space="preserve">  Repeat steps 25 to 32 on fresh samples using caustic in place of quicklime. [CONFIRM] taken from V1; the V1.2 step list has no caustic repeat although its record tables include 'Test Kaustik' 1 to 3.</w:t>
+      </w:r>
+    </w:p>
+    <w:p>
+      <w:pPr>
+        <w:spacing w:after="60" w:before="0" w:line="245"/>
+      </w:pPr>
+      <w:r>
+        <w:rPr>
+          <w:rFonts w:ascii="Calibri" w:cs="Calibri" w:eastAsia="Calibri" w:hAnsi="Calibri"/>
+          <w:sz w:val="17"/>
+          <w:szCs w:val="17"/>
+        </w:rPr>
+        <w:t xml:space="preserve">Record table [M]: for each addition record the pH, TDS before, reagent dose (g), pH after, TDS after, cumulative reagent weight, and consumption. [CONFIRM] the source reports solid quicklime and caustic as consumption in mL/L and mL/m3; g/L and kg/m3 are probably intended. The V1.2 record tables also carry typing errors (for example TDS '50020', weight '05632') and the caustic tables are headed 'quick lime' - do not carry those numbers forward.</w:t>
+      </w:r>
+    </w:p>
+    <w:p>
+      <w:pPr>
         <w:pStyle w:val="Heading1"/>
         <w:spacing w:after="120" w:before="260"/>
       </w:pPr>
@@ -3263,6 +3591,24 @@
           <w:szCs w:val="17"/>
         </w:rPr>
         <w:t xml:space="preserve">Martabe work instruction 'MHR1 sample - Konsumsi Quick lime metal removed' (Indonesian, undated; file name 'Work_Instruction_MHR_1_Liming_vs_Limingair') - Part C source</w:t>
+      </w:r>
+    </w:p>
+    <w:p>
+      <w:pPr>
+        <w:pStyle w:val="ListParagraph"/>
+        <w:numPr>
+          <w:ilvl w:val="0"/>
+          <w:numId w:val="1"/>
+        </w:numPr>
+        <w:spacing w:after="60" w:line="245"/>
+      </w:pPr>
+      <w:r>
+        <w:rPr>
+          <w:rFonts w:ascii="Calibri" w:cs="Calibri" w:eastAsia="Calibri" w:hAnsi="Calibri"/>
+          <w:sz w:val="17"/>
+          <w:szCs w:val="17"/>
+        </w:rPr>
+        <w:t xml:space="preserve">Martabe work instruction 'MHR1 sample - Konsumsi Quick lime dan caustic' V1 and V1.2 (Indonesian, undated) - Part D source</w:t>
       </w:r>
     </w:p>
     <w:sectPr>

</xml_diff>